<commit_message>
FN3: audit fixes (graph descriptions in a closed disclosure, cross-item spoilers, decreasing and complete-the-list items, Quick Summary conventions), audit md, README row
Adds an opt-in figure setting, collapse: true, used only by FN3; the page, worked-examples extractor and Canvas quiz honor it.

Co-Authored-By: Claude Opus 5.5 <noreply@anthropic.com>
Claude-Session: https://claude.ai/code/session_013Y8PfETWcMLvmUEpCdE8Wq
</commit_message>
<xml_diff>
--- a/support-materials/FN3/FN3_worked_examples.docx
+++ b/support-materials/FN3/FN3_worked_examples.docx
@@ -111,7 +111,7 @@
           <wp:inline distT="0" distB="0" distL="0" distR="0">
             <wp:extent cx="3267075" cy="2476500"/>
             <wp:effectExtent t="0" r="0" b="0" l="0"/>
-            <wp:docPr id="1" name="dr1" descr="The graph of a function g with a dot at each end. Plotted data: A graph of g on a grid with lines every 1 unit, with x from −12 to 12 and y from −5 to 13. It starts at a filled dot at (−11, 12) and falls steeply, crossing the x-axis at (−9, 0), to a low point at (−7, −4). It rises, crossing the x-axis at (−5, 0), to a high point at (−1, 9), then falls through (0, 5) to a low point at (4, 2). Then it rises to an open dot at (11, 8)." title="The graph of a function g with a dot at each end"/>
+            <wp:docPr id="1" name="dr1" descr="The graph of a function g with a dot at each end. Plotted data: A graph of g on a grid with lines every 1 unit, with x from −12 to 12 and y from −5 to 13. From a filled dot at (−11, 12), it goes down steeply through (−9, 0) to (−7, −4), where it turns. It goes up through (−5, 0) to (−1, 9), where it turns, then down through (0, 5) to (4, 2), where it turns again. Then it goes up to an open dot at (11, 8). There are small corners where its pieces join, at x = −5, −2, 0 and 8." title="The graph of a function g with a dot at each end"/>
             <wp:cNvGraphicFramePr>
               <a:graphicFrameLocks xmlns:a="http://schemas.openxmlformats.org/drawingml/2006/main" noChangeAspect="1"/>
             </wp:cNvGraphicFramePr>
@@ -165,7 +165,7 @@
           <w:sz w:val="22"/>
           <w:szCs w:val="22"/>
         </w:rPr>
-        <w:t xml:space="preserve">A graph of g on a grid with lines every 1 unit, with x from −12 to 12 and y from −5 to 13. It starts at a filled dot at (−11, 12) and falls steeply, crossing the x-axis at (−9, 0), to a low point at (−7, −4). It rises, crossing the x-axis at (−5, 0), to a high point at (−1, 9), then falls through (0, 5) to a low point at (4, 2). Then it rises to an open dot at (11, 8).</w:t>
+        <w:t xml:space="preserve">A graph of g on a grid with lines every 1 unit, with x from −12 to 12 and y from −5 to 13. From a filled dot at (−11, 12), it goes down steeply through (−9, 0) to (−7, −4), where it turns. It goes up through (−5, 0) to (−1, 9), where it turns, then down through (0, 5) to (4, 2), where it turns again. Then it goes up to an open dot at (11, 8). There are small corners where its pieces join, at x = −5, −2, 0 and 8.</w:t>
       </w:r>
     </w:p>
     <w:p>
@@ -246,7 +246,7 @@
         <w:t xml:space="preserve">D.  </w:t>
       </w:r>
       <w:r>
-        <w:t xml:space="preserve">[−4, 12]</w:t>
+        <w:t xml:space="preserve">[−12, 12]</w:t>
       </w:r>
     </w:p>
     <w:p>
@@ -330,20 +330,10 @@
           <w:i/>
           <w:iCs/>
         </w:rPr>
-        <w:t xml:space="preserve">[−4,12]</w:t>
-      </w:r>
-      <w:r>
-        <w:t xml:space="preserve"> is the range, the </w:t>
-      </w:r>
-      <w:r>
-        <w:rPr>
-          <w:i/>
-          <w:iCs/>
-        </w:rPr>
-        <w:t xml:space="preserve">y</w:t>
-      </w:r>
-      <w:r>
-        <w:t xml:space="preserve">-values. </w:t>
+        <w:t xml:space="preserve">[−12,12]</w:t>
+      </w:r>
+      <w:r>
+        <w:t xml:space="preserve"> reads the edges of the grid instead of the graph. </w:t>
       </w:r>
       <w:r>
         <w:rPr>
@@ -380,7 +370,7 @@
           <wp:inline distT="0" distB="0" distL="0" distR="0">
             <wp:extent cx="3267075" cy="2476500"/>
             <wp:effectExtent t="0" r="0" b="0" l="0"/>
-            <wp:docPr id="1" name="dr2" descr="The graph of a function g with a dot at each end. Plotted data: A graph of g on a grid with lines every 1 unit, with x from −12 to 12 and y from −5 to 13. It starts at a filled dot at (−11, 12) and falls steeply, crossing the x-axis at (−9, 0), to a low point at (−7, −4). It rises, crossing the x-axis at (−5, 0), to a high point at (−1, 9), then falls through (0, 5) to a low point at (4, 2). Then it rises to an open dot at (11, 8)." title="The graph of a function g with a dot at each end"/>
+            <wp:docPr id="1" name="dr2" descr="The graph of a function g with a dot at each end. Plotted data: A graph of g on a grid with lines every 1 unit, with x from −12 to 12 and y from −5 to 13. From a filled dot at (−11, 12), it goes down steeply through (−9, 0) to (−7, −4), where it turns. It goes up through (−5, 0) to (−1, 9), where it turns, then down through (0, 5) to (4, 2), where it turns again. Then it goes up to an open dot at (11, 8). There are small corners where its pieces join, at x = −5, −2, 0 and 8." title="The graph of a function g with a dot at each end"/>
             <wp:cNvGraphicFramePr>
               <a:graphicFrameLocks xmlns:a="http://schemas.openxmlformats.org/drawingml/2006/main" noChangeAspect="1"/>
             </wp:cNvGraphicFramePr>
@@ -434,7 +424,7 @@
           <w:sz w:val="22"/>
           <w:szCs w:val="22"/>
         </w:rPr>
-        <w:t xml:space="preserve">A graph of g on a grid with lines every 1 unit, with x from −12 to 12 and y from −5 to 13. It starts at a filled dot at (−11, 12) and falls steeply, crossing the x-axis at (−9, 0), to a low point at (−7, −4). It rises, crossing the x-axis at (−5, 0), to a high point at (−1, 9), then falls through (0, 5) to a low point at (4, 2). Then it rises to an open dot at (11, 8).</w:t>
+        <w:t xml:space="preserve">A graph of g on a grid with lines every 1 unit, with x from −12 to 12 and y from −5 to 13. From a filled dot at (−11, 12), it goes down steeply through (−9, 0) to (−7, −4), where it turns. It goes up through (−5, 0) to (−1, 9), where it turns, then down through (0, 5) to (4, 2), where it turns again. Then it goes up to an open dot at (11, 8). There are small corners where its pieces join, at x = −5, −2, 0 and 8.</w:t>
       </w:r>
     </w:p>
     <w:p>
@@ -483,7 +473,7 @@
         <w:t xml:space="preserve">B.  </w:t>
       </w:r>
       <w:r>
-        <w:t xml:space="preserve">[−11, 11)</w:t>
+        <w:t xml:space="preserve">[−4, 8)</w:t>
       </w:r>
     </w:p>
     <w:p>
@@ -579,10 +569,10 @@
           <w:i/>
           <w:iCs/>
         </w:rPr>
-        <w:t xml:space="preserve">[−11,11)</w:t>
-      </w:r>
-      <w:r>
-        <w:t xml:space="preserve"> is the domain; and </w:t>
+        <w:t xml:space="preserve">[−4,8)</w:t>
+      </w:r>
+      <w:r>
+        <w:t xml:space="preserve"> uses the height of the right end, which is lower than the left end; and </w:t>
       </w:r>
       <w:r>
         <w:rPr>
@@ -629,7 +619,7 @@
           <wp:inline distT="0" distB="0" distL="0" distR="0">
             <wp:extent cx="3267075" cy="2476500"/>
             <wp:effectExtent t="0" r="0" b="0" l="0"/>
-            <wp:docPr id="1" name="dr3" descr="The graph of a function g with a dot at each end. Plotted data: A graph of g on a grid with lines every 1 unit, with x from −12 to 12 and y from −5 to 13. It starts at a filled dot at (−11, 12) and falls steeply, crossing the x-axis at (−9, 0), to a low point at (−7, −4). It rises, crossing the x-axis at (−5, 0), to a high point at (−1, 9), then falls through (0, 5) to a low point at (4, 2). Then it rises to an open dot at (11, 8)." title="The graph of a function g with a dot at each end"/>
+            <wp:docPr id="1" name="dr3" descr="The graph of a function g with a dot at each end. Plotted data: A graph of g on a grid with lines every 1 unit, with x from −12 to 12 and y from −5 to 13. From a filled dot at (−11, 12), it goes down steeply through (−9, 0) to (−7, −4), where it turns. It goes up through (−5, 0) to (−1, 9), where it turns, then down through (0, 5) to (4, 2), where it turns again. Then it goes up to an open dot at (11, 8). There are small corners where its pieces join, at x = −5, −2, 0 and 8." title="The graph of a function g with a dot at each end"/>
             <wp:cNvGraphicFramePr>
               <a:graphicFrameLocks xmlns:a="http://schemas.openxmlformats.org/drawingml/2006/main" noChangeAspect="1"/>
             </wp:cNvGraphicFramePr>
@@ -683,7 +673,7 @@
           <w:sz w:val="22"/>
           <w:szCs w:val="22"/>
         </w:rPr>
-        <w:t xml:space="preserve">A graph of g on a grid with lines every 1 unit, with x from −12 to 12 and y from −5 to 13. It starts at a filled dot at (−11, 12) and falls steeply, crossing the x-axis at (−9, 0), to a low point at (−7, −4). It rises, crossing the x-axis at (−5, 0), to a high point at (−1, 9), then falls through (0, 5) to a low point at (4, 2). Then it rises to an open dot at (11, 8).</w:t>
+        <w:t xml:space="preserve">A graph of g on a grid with lines every 1 unit, with x from −12 to 12 and y from −5 to 13. From a filled dot at (−11, 12), it goes down steeply through (−9, 0) to (−7, −4), where it turns. It goes up through (−5, 0) to (−1, 9), where it turns, then down through (0, 5) to (4, 2), where it turns again. Then it goes up to an open dot at (11, 8). There are small corners where its pieces join, at x = −5, −2, 0 and 8.</w:t>
       </w:r>
     </w:p>
     <w:p>
@@ -732,7 +722,7 @@
         <w:t xml:space="preserve">B.  </w:t>
       </w:r>
       <w:r>
-        <w:t xml:space="preserve">(0, 5)</w:t>
+        <w:t xml:space="preserve">(0, −9) and (0, −5)</w:t>
       </w:r>
     </w:p>
     <w:p>
@@ -748,7 +738,7 @@
         <w:t xml:space="preserve">C.  </w:t>
       </w:r>
       <w:r>
-        <w:t xml:space="preserve">(−9, 0), (−5, 0), and (0, 5)</w:t>
+        <w:t xml:space="preserve">(−7, 0) and (4, 0)</w:t>
       </w:r>
     </w:p>
     <w:p>
@@ -835,30 +825,50 @@
           <w:i/>
           <w:iCs/>
         </w:rPr>
-        <w:t xml:space="preserve">(0,5)</w:t>
-      </w:r>
-      <w:r>
-        <w:t xml:space="preserve"> is the </w:t>
-      </w:r>
-      <w:r>
-        <w:rPr>
-          <w:i/>
-          <w:iCs/>
-        </w:rPr>
-        <w:t xml:space="preserve">y</w:t>
-      </w:r>
-      <w:r>
-        <w:t xml:space="preserve">-intercept, where the graph crosses the </w:t>
-      </w:r>
-      <w:r>
-        <w:rPr>
-          <w:i/>
-          <w:iCs/>
-        </w:rPr>
-        <w:t xml:space="preserve">y</w:t>
-      </w:r>
-      <w:r>
-        <w:t xml:space="preserve">-axis; and the graph starts at </w:t>
+        <w:t xml:space="preserve">(0,−9)</w:t>
+      </w:r>
+      <w:r>
+        <w:t xml:space="preserve"> and </w:t>
+      </w:r>
+      <w:r>
+        <w:rPr>
+          <w:i/>
+          <w:iCs/>
+        </w:rPr>
+        <w:t xml:space="preserve">(0,−5)</w:t>
+      </w:r>
+      <w:r>
+        <w:t xml:space="preserve"> swap the coordinates; </w:t>
+      </w:r>
+      <w:r>
+        <w:rPr>
+          <w:i/>
+          <w:iCs/>
+        </w:rPr>
+        <w:t xml:space="preserve">(−7,0)</w:t>
+      </w:r>
+      <w:r>
+        <w:t xml:space="preserve"> and </w:t>
+      </w:r>
+      <w:r>
+        <w:rPr>
+          <w:i/>
+          <w:iCs/>
+        </w:rPr>
+        <w:t xml:space="preserve">(4,0)</w:t>
+      </w:r>
+      <w:r>
+        <w:t xml:space="preserve"> use the </w:t>
+      </w:r>
+      <w:r>
+        <w:rPr>
+          <w:i/>
+          <w:iCs/>
+        </w:rPr>
+        <w:t xml:space="preserve">x</w:t>
+      </w:r>
+      <w:r>
+        <w:t xml:space="preserve">-values of the low turning points, which are not on the axis; and the graph starts at </w:t>
       </w:r>
       <w:r>
         <w:rPr>
@@ -921,7 +931,7 @@
           <wp:inline distT="0" distB="0" distL="0" distR="0">
             <wp:extent cx="3267075" cy="2476500"/>
             <wp:effectExtent t="0" r="0" b="0" l="0"/>
-            <wp:docPr id="1" name="dr4" descr="The graph of a function g with a dot at each end. Plotted data: A graph of g on a grid with lines every 1 unit, with x from −12 to 12 and y from −5 to 13. It starts at a filled dot at (−11, 12) and falls steeply, crossing the x-axis at (−9, 0), to a low point at (−7, −4). It rises, crossing the x-axis at (−5, 0), to a high point at (−1, 9), then falls through (0, 5) to a low point at (4, 2). Then it rises to an open dot at (11, 8)." title="The graph of a function g with a dot at each end"/>
+            <wp:docPr id="1" name="dr4" descr="The graph of a function g with a dot at each end. Plotted data: A graph of g on a grid with lines every 1 unit, with x from −12 to 12 and y from −5 to 13. From a filled dot at (−11, 12), it goes down steeply through (−9, 0) to (−7, −4), where it turns. It goes up through (−5, 0) to (−1, 9), where it turns, then down through (0, 5) to (4, 2), where it turns again. Then it goes up to an open dot at (11, 8). There are small corners where its pieces join, at x = −5, −2, 0 and 8." title="The graph of a function g with a dot at each end"/>
             <wp:cNvGraphicFramePr>
               <a:graphicFrameLocks xmlns:a="http://schemas.openxmlformats.org/drawingml/2006/main" noChangeAspect="1"/>
             </wp:cNvGraphicFramePr>
@@ -975,7 +985,7 @@
           <w:sz w:val="22"/>
           <w:szCs w:val="22"/>
         </w:rPr>
-        <w:t xml:space="preserve">A graph of g on a grid with lines every 1 unit, with x from −12 to 12 and y from −5 to 13. It starts at a filled dot at (−11, 12) and falls steeply, crossing the x-axis at (−9, 0), to a low point at (−7, −4). It rises, crossing the x-axis at (−5, 0), to a high point at (−1, 9), then falls through (0, 5) to a low point at (4, 2). Then it rises to an open dot at (11, 8).</w:t>
+        <w:t xml:space="preserve">A graph of g on a grid with lines every 1 unit, with x from −12 to 12 and y from −5 to 13. From a filled dot at (−11, 12), it goes down steeply through (−9, 0) to (−7, −4), where it turns. It goes up through (−5, 0) to (−1, 9), where it turns, then down through (0, 5) to (4, 2), where it turns again. Then it goes up to an open dot at (11, 8). There are small corners where its pieces join, at x = −5, −2, 0 and 8.</w:t>
       </w:r>
     </w:p>
     <w:p>
@@ -1168,7 +1178,7 @@
         <w:pageBreakBefore/>
       </w:pPr>
       <w:r>
-        <w:t xml:space="preserve">Example 5: Increasing</w:t>
+        <w:t xml:space="preserve">Example 5: Decreasing</w:t>
       </w:r>
     </w:p>
     <w:p>
@@ -1178,9 +1188,9 @@
       <w:r>
         <w:drawing>
           <wp:inline distT="0" distB="0" distL="0" distR="0">
-            <wp:extent cx="3267075" cy="2476500"/>
+            <wp:extent cx="2914650" cy="2476500"/>
             <wp:effectExtent t="0" r="0" b="0" l="0"/>
-            <wp:docPr id="1" name="rf1" descr="The graph of a function g with a dot at each end. Plotted data: A graph of g on a grid with lines every 1 unit, with x from −12 to 12 and y from −5 to 13. It starts at a filled dot at (−11, 12) and falls steeply, crossing the x-axis at (−9, 0), to a low point at (−7, −4). It rises, crossing the x-axis at (−5, 0), to a high point at (−1, 9), then falls through (0, 5) to a low point at (4, 2). Then it rises to an open dot at (11, 8)." title="The graph of a function g with a dot at each end"/>
+            <wp:docPr id="1" name="rf1" descr="The graph of a function g with a dot at each end. Plotted data: A graph of g on a grid with lines every 1 unit, with x from −17 to 10 and y from −16 to 7. From an open dot at (−16, −15), it goes up steeply through (−13, 0) to (−10, 5), where it turns. It goes down through (−7, 0) to (−2, −8), where it turns, then up through (0, −4) to (3, −2), where it turns again. Then it goes down to a filled dot at (9, −7). There are small corners where its pieces join, at x = −7, −4, 0 and 6." title="The graph of a function g with a dot at each end"/>
             <wp:cNvGraphicFramePr>
               <a:graphicFrameLocks xmlns:a="http://schemas.openxmlformats.org/drawingml/2006/main" noChangeAspect="1"/>
             </wp:cNvGraphicFramePr>
@@ -1203,7 +1213,7 @@
                   <pic:spPr bwMode="auto">
                     <a:xfrm>
                       <a:off x="0" y="0"/>
-                      <a:ext cx="3267075" cy="2476500"/>
+                      <a:ext cx="2914650" cy="2476500"/>
                     </a:xfrm>
                     <a:prstGeom prst="rect">
                       <a:avLst/>
@@ -1234,7 +1244,7 @@
           <w:sz w:val="22"/>
           <w:szCs w:val="22"/>
         </w:rPr>
-        <w:t xml:space="preserve">A graph of g on a grid with lines every 1 unit, with x from −12 to 12 and y from −5 to 13. It starts at a filled dot at (−11, 12) and falls steeply, crossing the x-axis at (−9, 0), to a low point at (−7, −4). It rises, crossing the x-axis at (−5, 0), to a high point at (−1, 9), then falls through (0, 5) to a low point at (4, 2). Then it rises to an open dot at (11, 8).</w:t>
+        <w:t xml:space="preserve">A graph of g on a grid with lines every 1 unit, with x from −17 to 10 and y from −16 to 7. From an open dot at (−16, −15), it goes up steeply through (−13, 0) to (−10, 5), where it turns. It goes down through (−7, 0) to (−2, −8), where it turns, then up through (0, −4) to (3, −2), where it turns again. Then it goes down to a filled dot at (9, −7). There are small corners where its pieces join, at x = −7, −4, 0 and 6.</w:t>
       </w:r>
     </w:p>
     <w:p>
@@ -1251,7 +1261,7 @@
         <w:spacing w:after="120" w:before="80" w:line="300"/>
       </w:pPr>
       <w:r>
-        <w:t xml:space="preserve">On which intervals is g increasing?</w:t>
+        <w:t xml:space="preserve">On which intervals is g decreasing?</w:t>
       </w:r>
     </w:p>
     <w:p>
@@ -1267,7 +1277,7 @@
         <w:t xml:space="preserve">A.  </w:t>
       </w:r>
       <w:r>
-        <w:t xml:space="preserve">(−4, 9) ∪ (2, 8)</w:t>
+        <w:t xml:space="preserve">(−8, 5) ∪ (−7, −2)</w:t>
       </w:r>
     </w:p>
     <w:p>
@@ -1283,7 +1293,7 @@
         <w:t xml:space="preserve">B.  </w:t>
       </w:r>
       <w:r>
-        <w:t xml:space="preserve">(−11, −7) ∪ (−1, 4)</w:t>
+        <w:t xml:space="preserve">(−10, −2) ∪ (3, 9]</w:t>
       </w:r>
     </w:p>
     <w:p>
@@ -1299,7 +1309,7 @@
         <w:t xml:space="preserve">C.  </w:t>
       </w:r>
       <w:r>
-        <w:t xml:space="preserve">(−7, −1) ∪ (4, 11)</w:t>
+        <w:t xml:space="preserve">(−10, −2) ∪ (3, 9)</w:t>
       </w:r>
     </w:p>
     <w:p>
@@ -1315,7 +1325,7 @@
         <w:t xml:space="preserve">D.  </w:t>
       </w:r>
       <w:r>
-        <w:t xml:space="preserve">(−7, 4)</w:t>
+        <w:t xml:space="preserve">(−10, 3)</w:t>
       </w:r>
     </w:p>
     <w:p>
@@ -1342,34 +1352,34 @@
         <w:t xml:space="preserve">x</w:t>
       </w:r>
       <w:r>
-        <w:t xml:space="preserve">-values where the graph goes up: from the low point at </w:t>
-      </w:r>
-      <w:r>
-        <w:rPr>
-          <w:i/>
-          <w:iCs/>
-        </w:rPr>
-        <w:t xml:space="preserve">x=−7</w:t>
-      </w:r>
-      <w:r>
-        <w:t xml:space="preserve"> to the peak at </w:t>
-      </w:r>
-      <w:r>
-        <w:rPr>
-          <w:i/>
-          <w:iCs/>
-        </w:rPr>
-        <w:t xml:space="preserve">x=−1</w:t>
-      </w:r>
-      <w:r>
-        <w:t xml:space="preserve">, and from the low point at </w:t>
-      </w:r>
-      <w:r>
-        <w:rPr>
-          <w:i/>
-          <w:iCs/>
-        </w:rPr>
-        <w:t xml:space="preserve">x=4</w:t>
+        <w:t xml:space="preserve">-values where the graph goes down: from the turn at </w:t>
+      </w:r>
+      <w:r>
+        <w:rPr>
+          <w:i/>
+          <w:iCs/>
+        </w:rPr>
+        <w:t xml:space="preserve">x=−10</w:t>
+      </w:r>
+      <w:r>
+        <w:t xml:space="preserve"> to the turn at </w:t>
+      </w:r>
+      <w:r>
+        <w:rPr>
+          <w:i/>
+          <w:iCs/>
+        </w:rPr>
+        <w:t xml:space="preserve">x=−2</w:t>
+      </w:r>
+      <w:r>
+        <w:t xml:space="preserve">, and from the turn at </w:t>
+      </w:r>
+      <w:r>
+        <w:rPr>
+          <w:i/>
+          <w:iCs/>
+        </w:rPr>
+        <w:t xml:space="preserve">x=3</w:t>
       </w:r>
       <w:r>
         <w:t xml:space="preserve"> to the right end, </w:t>
@@ -1379,69 +1389,59 @@
           <w:i/>
           <w:iCs/>
         </w:rPr>
-        <w:t xml:space="preserve">x=11</w:t>
-      </w:r>
-      <w:r>
-        <w:t xml:space="preserve">. Intervals of increase use </w:t>
-      </w:r>
-      <w:r>
-        <w:rPr>
-          <w:i/>
-          <w:iCs/>
-        </w:rPr>
-        <w:t xml:space="preserve">x</w:t>
-      </w:r>
-      <w:r>
-        <w:t xml:space="preserve">-values, with parentheses. </w:t>
-      </w:r>
-      <w:r>
-        <w:rPr>
-          <w:i/>
-          <w:iCs/>
-        </w:rPr>
-        <w:t xml:space="preserve">(−4,9)∪(2,8)</w:t>
-      </w:r>
-      <w:r>
-        <w:t xml:space="preserve"> uses </w:t>
-      </w:r>
-      <w:r>
-        <w:rPr>
-          <w:i/>
-          <w:iCs/>
-        </w:rPr>
-        <w:t xml:space="preserve">y</w:t>
-      </w:r>
-      <w:r>
-        <w:t xml:space="preserve">-values; </w:t>
-      </w:r>
-      <w:r>
-        <w:rPr>
-          <w:i/>
-          <w:iCs/>
-        </w:rPr>
-        <w:t xml:space="preserve">(−11,−7)∪(−1,4)</w:t>
-      </w:r>
-      <w:r>
-        <w:t xml:space="preserve"> is where it decreases; and </w:t>
-      </w:r>
-      <w:r>
-        <w:rPr>
-          <w:i/>
-          <w:iCs/>
-        </w:rPr>
-        <w:t xml:space="preserve">(−7,4)</w:t>
-      </w:r>
-      <w:r>
-        <w:t xml:space="preserve"> runs from one low point to the other, across a stretch where the graph goes down. </w:t>
-      </w:r>
-      <w:r>
-        <w:rPr>
-          <w:b/>
-          <w:bCs/>
-          <w:i/>
-          <w:iCs/>
-        </w:rPr>
-        <w:t xml:space="preserve">(−7,−1)∪(4,11)</w:t>
+        <w:t xml:space="preserve">x=9</w:t>
+      </w:r>
+      <w:r>
+        <w:t xml:space="preserve">. Intervals of increase and decrease are written with parentheses, even at a filled dot: CheckIt writes </w:t>
+      </w:r>
+      <w:r>
+        <w:rPr>
+          <w:i/>
+          <w:iCs/>
+        </w:rPr>
+        <w:t xml:space="preserve">(3,9)</w:t>
+      </w:r>
+      <w:r>
+        <w:t xml:space="preserve"> although 9 is in the domain. </w:t>
+      </w:r>
+      <w:r>
+        <w:rPr>
+          <w:i/>
+          <w:iCs/>
+        </w:rPr>
+        <w:t xml:space="preserve">(−8,5)∪(−7,−2)</w:t>
+      </w:r>
+      <w:r>
+        <w:t xml:space="preserve"> uses heights; </w:t>
+      </w:r>
+      <w:r>
+        <w:rPr>
+          <w:i/>
+          <w:iCs/>
+        </w:rPr>
+        <w:t xml:space="preserve">(3,9]</w:t>
+      </w:r>
+      <w:r>
+        <w:t xml:space="preserve"> copies the bracket from the domain; and </w:t>
+      </w:r>
+      <w:r>
+        <w:rPr>
+          <w:i/>
+          <w:iCs/>
+        </w:rPr>
+        <w:t xml:space="preserve">(−10,3)</w:t>
+      </w:r>
+      <w:r>
+        <w:t xml:space="preserve"> runs across a stretch where the graph goes up. </w:t>
+      </w:r>
+      <w:r>
+        <w:rPr>
+          <w:b/>
+          <w:bCs/>
+          <w:i/>
+          <w:iCs/>
+        </w:rPr>
+        <w:t xml:space="preserve">(−10,−2)∪(3,9)</w:t>
       </w:r>
       <w:r>
         <w:rPr>
@@ -1469,7 +1469,7 @@
           <wp:inline distT="0" distB="0" distL="0" distR="0">
             <wp:extent cx="3267075" cy="2476500"/>
             <wp:effectExtent t="0" r="0" b="0" l="0"/>
-            <wp:docPr id="1" name="rf2" descr="The graph of a function g with a dot at each end. Plotted data: A graph of g on a grid with lines every 1 unit, with x from −12 to 12 and y from −5 to 13. It starts at a filled dot at (−11, 12) and falls steeply, crossing the x-axis at (−9, 0), to a low point at (−7, −4). It rises, crossing the x-axis at (−5, 0), to a high point at (−1, 9), then falls through (0, 5) to a low point at (4, 2). Then it rises to an open dot at (11, 8)." title="The graph of a function g with a dot at each end"/>
+            <wp:docPr id="1" name="rf2" descr="The graph of a function g with a dot at each end. Plotted data: A graph of g on a grid with lines every 1 unit, with x from −12 to 12 and y from −5 to 13. From a filled dot at (−11, 12), it goes down steeply through (−9, 0) to (−7, −4), where it turns. It goes up through (−5, 0) to (−1, 9), where it turns, then down through (0, 5) to (4, 2), where it turns again. Then it goes up to an open dot at (11, 8). There are small corners where its pieces join, at x = −5, −2, 0 and 8." title="The graph of a function g with a dot at each end"/>
             <wp:cNvGraphicFramePr>
               <a:graphicFrameLocks xmlns:a="http://schemas.openxmlformats.org/drawingml/2006/main" noChangeAspect="1"/>
             </wp:cNvGraphicFramePr>
@@ -1523,7 +1523,7 @@
           <w:sz w:val="22"/>
           <w:szCs w:val="22"/>
         </w:rPr>
-        <w:t xml:space="preserve">A graph of g on a grid with lines every 1 unit, with x from −12 to 12 and y from −5 to 13. It starts at a filled dot at (−11, 12) and falls steeply, crossing the x-axis at (−9, 0), to a low point at (−7, −4). It rises, crossing the x-axis at (−5, 0), to a high point at (−1, 9), then falls through (0, 5) to a low point at (4, 2). Then it rises to an open dot at (11, 8).</w:t>
+        <w:t xml:space="preserve">A graph of g on a grid with lines every 1 unit, with x from −12 to 12 and y from −5 to 13. From a filled dot at (−11, 12), it goes down steeply through (−9, 0) to (−7, −4), where it turns. It goes up through (−5, 0) to (−1, 9), where it turns, then down through (0, 5) to (4, 2), where it turns again. Then it goes up to an open dot at (11, 8). There are small corners where its pieces join, at x = −5, −2, 0 and 8.</w:t>
       </w:r>
     </w:p>
     <w:p>
@@ -1724,7 +1724,7 @@
           <wp:inline distT="0" distB="0" distL="0" distR="0">
             <wp:extent cx="3267075" cy="2476500"/>
             <wp:effectExtent t="0" r="0" b="0" l="0"/>
-            <wp:docPr id="1" name="rf3" descr="The graph of a function g with a dot at each end. Plotted data: A graph of g on a grid with lines every 1 unit, with x from −12 to 12 and y from −5 to 13. It starts at a filled dot at (−11, 12) and falls steeply, crossing the x-axis at (−9, 0), to a low point at (−7, −4). It rises, crossing the x-axis at (−5, 0), to a high point at (−1, 9), then falls through (0, 5) to a low point at (4, 2). Then it rises to an open dot at (11, 8)." title="The graph of a function g with a dot at each end"/>
+            <wp:docPr id="1" name="rf3" descr="The graph of a function g with a dot at each end. Plotted data: A graph of g on a grid with lines every 1 unit, with x from −12 to 12 and y from −5 to 13. From a filled dot at (−11, 12), it goes down steeply through (−9, 0) to (−7, −4), where it turns. It goes up through (−5, 0) to (−1, 9), where it turns, then down through (0, 5) to (4, 2), where it turns again. Then it goes up to an open dot at (11, 8). There are small corners where its pieces join, at x = −5, −2, 0 and 8." title="The graph of a function g with a dot at each end"/>
             <wp:cNvGraphicFramePr>
               <a:graphicFrameLocks xmlns:a="http://schemas.openxmlformats.org/drawingml/2006/main" noChangeAspect="1"/>
             </wp:cNvGraphicFramePr>
@@ -1778,7 +1778,7 @@
           <w:sz w:val="22"/>
           <w:szCs w:val="22"/>
         </w:rPr>
-        <w:t xml:space="preserve">A graph of g on a grid with lines every 1 unit, with x from −12 to 12 and y from −5 to 13. It starts at a filled dot at (−11, 12) and falls steeply, crossing the x-axis at (−9, 0), to a low point at (−7, −4). It rises, crossing the x-axis at (−5, 0), to a high point at (−1, 9), then falls through (0, 5) to a low point at (4, 2). Then it rises to an open dot at (11, 8).</w:t>
+        <w:t xml:space="preserve">A graph of g on a grid with lines every 1 unit, with x from −12 to 12 and y from −5 to 13. From a filled dot at (−11, 12), it goes down steeply through (−9, 0) to (−7, −4), where it turns. It goes up through (−5, 0) to (−1, 9), where it turns, then down through (0, 5) to (4, 2), where it turns again. Then it goes up to an open dot at (11, 8). There are small corners where its pieces join, at x = −5, −2, 0 and 8.</w:t>
       </w:r>
     </w:p>
     <w:p>
@@ -1924,7 +1924,7 @@
           <wp:inline distT="0" distB="0" distL="0" distR="0">
             <wp:extent cx="2924175" cy="2476500"/>
             <wp:effectExtent t="0" r="0" b="0" l="0"/>
-            <wp:docPr id="1" name="rf4" descr="The graph of a function g with a dot at each end. Plotted data: A graph of g on a grid with lines every 1 unit, with x from −17 to 10 and y from −16 to 7. It starts at an open dot at (−16, −15) and rises steeply, crossing the x-axis at (−13, 0), to a high point at (−10, 5). It falls, crossing the x-axis at (−7, 0), to a low point at (−2, −8), then rises through (0, −4) to a high point at (3, −2). Then it falls to a filled dot at (9, −7)." title="The graph of a function g with a dot at each end"/>
+            <wp:docPr id="1" name="rf4" descr="The graph of a function g with a dot at each end. Plotted data: A graph of g on a grid with lines every 1 unit, with x from −17 to 10 and y from −16 to 7. From an open dot at (−16, −15), it goes up steeply through (−13, 0) to (−10, 5), where it turns. It goes down through (−7, 0) to (−2, −8), where it turns, then up through (0, −4) to (3, −2), where it turns again. Then it goes down to a filled dot at (9, −7). There are small corners where its pieces join, at x = −7, −4, 0 and 6." title="The graph of a function g with a dot at each end"/>
             <wp:cNvGraphicFramePr>
               <a:graphicFrameLocks xmlns:a="http://schemas.openxmlformats.org/drawingml/2006/main" noChangeAspect="1"/>
             </wp:cNvGraphicFramePr>
@@ -1978,7 +1978,7 @@
           <w:sz w:val="22"/>
           <w:szCs w:val="22"/>
         </w:rPr>
-        <w:t xml:space="preserve">A graph of g on a grid with lines every 1 unit, with x from −17 to 10 and y from −16 to 7. It starts at an open dot at (−16, −15) and rises steeply, crossing the x-axis at (−13, 0), to a high point at (−10, 5). It falls, crossing the x-axis at (−7, 0), to a low point at (−2, −8), then rises through (0, −4) to a high point at (3, −2). Then it falls to a filled dot at (9, −7).</w:t>
+        <w:t xml:space="preserve">A graph of g on a grid with lines every 1 unit, with x from −17 to 10 and y from −16 to 7. From an open dot at (−16, −15), it goes up steeply through (−13, 0) to (−10, 5), where it turns. It goes down through (−7, 0) to (−2, −8), where it turns, then up through (0, −4) to (3, −2), where it turns again. Then it goes down to a filled dot at (9, −7). There are small corners where its pieces join, at x = −7, −4, 0 and 6.</w:t>
       </w:r>
     </w:p>
     <w:p>
@@ -2414,7 +2414,27 @@
         <w:t xml:space="preserve">x=10</w:t>
       </w:r>
       <w:r>
-        <w:t xml:space="preserve">. The graph goes all the way across between them. Arrows would mean the graph keeps going forever, but this domain stops at both ends. </w:t>
+        <w:t xml:space="preserve">. The graph goes all the way across between them. Filled dots at both ends would be </w:t>
+      </w:r>
+      <w:r>
+        <w:rPr>
+          <w:i/>
+          <w:iCs/>
+        </w:rPr>
+        <w:t xml:space="preserve">[−8,10]</w:t>
+      </w:r>
+      <w:r>
+        <w:t xml:space="preserve">, and open dots at both ends would be </w:t>
+      </w:r>
+      <w:r>
+        <w:rPr>
+          <w:i/>
+          <w:iCs/>
+        </w:rPr>
+        <w:t xml:space="preserve">(−8,10)</w:t>
+      </w:r>
+      <w:r>
+        <w:t xml:space="preserve">. Arrows would mean the graph keeps going forever, but this domain stops at both ends. </w:t>
       </w:r>
       <w:r>
         <w:rPr>
@@ -2430,146 +2450,7 @@
         <w:pageBreakBefore/>
       </w:pPr>
       <w:r>
-        <w:t xml:space="preserve">Example 11: Between Turns</w:t>
-      </w:r>
-    </w:p>
-    <w:p>
-      <w:pPr>
-        <w:spacing w:after="200" w:before="200"/>
-        <w:jc w:val="center"/>
-      </w:pPr>
-      <w:r>
-        <w:rPr>
-          <w:i/>
-          <w:iCs/>
-          <w:sz w:val="40"/>
-          <w:szCs w:val="40"/>
-        </w:rPr>
-        <w:t xml:space="preserve">(−2,7) and (3,1)</w:t>
-      </w:r>
-    </w:p>
-    <w:p>
-      <w:pPr>
-        <w:pStyle w:val="Heading3"/>
-        <w:keepNext/>
-      </w:pPr>
-      <w:r>
-        <w:t xml:space="preserve">Question</w:t>
-      </w:r>
-    </w:p>
-    <w:p>
-      <w:pPr>
-        <w:spacing w:after="120" w:before="80" w:line="300"/>
-      </w:pPr>
-      <w:r>
-        <w:t xml:space="preserve">Your graph has a local maximum at (−2, 7) and a local minimum at (3, 1), with no turning points between them. What does it do from x = −2 to x = 3?</w:t>
-      </w:r>
-    </w:p>
-    <w:p>
-      <w:pPr>
-        <w:spacing w:after="40" w:before="20"/>
-        <w:ind w:left="360"/>
-      </w:pPr>
-      <w:r>
-        <w:rPr>
-          <w:b/>
-          <w:bCs/>
-        </w:rPr>
-        <w:t xml:space="preserve">A.  </w:t>
-      </w:r>
-      <w:r>
-        <w:t xml:space="preserve">It increases</w:t>
-      </w:r>
-    </w:p>
-    <w:p>
-      <w:pPr>
-        <w:spacing w:after="40" w:before="20"/>
-        <w:ind w:left="360"/>
-      </w:pPr>
-      <w:r>
-        <w:rPr>
-          <w:b/>
-          <w:bCs/>
-        </w:rPr>
-        <w:t xml:space="preserve">B.  </w:t>
-      </w:r>
-      <w:r>
-        <w:t xml:space="preserve">It decreases</w:t>
-      </w:r>
-    </w:p>
-    <w:p>
-      <w:pPr>
-        <w:spacing w:after="40" w:before="20"/>
-        <w:ind w:left="360"/>
-      </w:pPr>
-      <w:r>
-        <w:rPr>
-          <w:b/>
-          <w:bCs/>
-        </w:rPr>
-        <w:t xml:space="preserve">C.  </w:t>
-      </w:r>
-      <w:r>
-        <w:t xml:space="preserve">It stays at height 7</w:t>
-      </w:r>
-    </w:p>
-    <w:p>
-      <w:pPr>
-        <w:spacing w:after="40" w:before="20"/>
-        <w:ind w:left="360"/>
-      </w:pPr>
-      <w:r>
-        <w:rPr>
-          <w:b/>
-          <w:bCs/>
-        </w:rPr>
-        <w:t xml:space="preserve">D.  </w:t>
-      </w:r>
-      <w:r>
-        <w:t xml:space="preserve">It cannot be known</w:t>
-      </w:r>
-    </w:p>
-    <w:p>
-      <w:pPr>
-        <w:pStyle w:val="Heading3"/>
-        <w:keepNext/>
-      </w:pPr>
-      <w:r>
-        <w:t xml:space="preserve">Answer and reasoning</w:t>
-      </w:r>
-    </w:p>
-    <w:p>
-      <w:pPr>
-        <w:spacing w:after="120" w:before="80" w:line="300"/>
-      </w:pPr>
-      <w:r>
-        <w:t xml:space="preserve">From a high point at height 7 to a low point at height 1, with no turns in between, the graph has to go down the whole way: it decreases on </w:t>
-      </w:r>
-      <w:r>
-        <w:rPr>
-          <w:i/>
-          <w:iCs/>
-        </w:rPr>
-        <w:t xml:space="preserve">(−2,3)</w:t>
-      </w:r>
-      <w:r>
-        <w:t xml:space="preserve">. Increasing would put the higher point second; staying level would not reach 1; and with no other turning points, there is only one way to connect them. </w:t>
-      </w:r>
-      <w:r>
-        <w:rPr>
-          <w:b/>
-          <w:bCs/>
-        </w:rPr>
-        <w:t xml:space="preserve">It decreases.</w:t>
-      </w:r>
-    </w:p>
-    <w:p>
-      <w:pPr>
-        <w:pStyle w:val="Heading2"/>
-        <w:pageBreakBefore/>
-      </w:pPr>
-      <w:r>
-        <w:t xml:space="preserve">Example 12: Impossible?</w:t>
+        <w:t xml:space="preserve">Example 11: The Other Direction</w:t>
       </w:r>
     </w:p>
     <w:p>
@@ -2585,7 +2466,7 @@
         <w:t xml:space="preserve">Table 1. </w:t>
       </w:r>
       <w:r>
-        <w:t xml:space="preserve">Four lists of features for a sketch</w:t>
+        <w:t xml:space="preserve">The feature list for a sketch</w:t>
       </w:r>
     </w:p>
     <w:tbl>
@@ -2633,7 +2514,7 @@
                 <w:sz w:val="28"/>
                 <w:szCs w:val="28"/>
               </w:rPr>
-              <w:t xml:space="preserve">List</w:t>
+              <w:t xml:space="preserve">Domain</w:t>
             </w:r>
           </w:p>
         </w:tc>
@@ -2664,7 +2545,7 @@
                 <w:sz w:val="28"/>
                 <w:szCs w:val="28"/>
               </w:rPr>
-              <w:t xml:space="preserve">Features the graph must have</w:t>
+              <w:t xml:space="preserve">(−10, 9]</w:t>
             </w:r>
           </w:p>
         </w:tc>
@@ -2698,7 +2579,418 @@
                 <w:sz w:val="28"/>
                 <w:szCs w:val="28"/>
               </w:rPr>
-              <w:t xml:space="preserve">A</w:t>
+              <w:t xml:space="preserve">Local maxima</w:t>
+            </w:r>
+          </w:p>
+        </w:tc>
+        <w:tc>
+          <w:tcPr>
+            <w:tcW w:type="dxa" w:w="7900"/>
+            <w:tcBorders>
+              <w:top w:val="single" w:color="555555" w:sz="6"/>
+              <w:left w:val="single" w:color="555555" w:sz="6"/>
+              <w:bottom w:val="single" w:color="555555" w:sz="6"/>
+              <w:right w:val="single" w:color="555555" w:sz="6"/>
+            </w:tcBorders>
+            <w:tcMar>
+              <w:top w:type="dxa" w:w="80"/>
+              <w:left w:type="dxa" w:w="120"/>
+              <w:bottom w:type="dxa" w:w="80"/>
+              <w:right w:type="dxa" w:w="120"/>
+            </w:tcMar>
+          </w:tcPr>
+          <w:p>
+            <w:pPr>
+              <w:jc w:val="center"/>
+            </w:pPr>
+            <w:r>
+              <w:rPr>
+                <w:b w:val="false"/>
+                <w:bCs w:val="false"/>
+                <w:sz w:val="28"/>
+                <w:szCs w:val="28"/>
+              </w:rPr>
+              <w:t xml:space="preserve">(−8, 4) and (3, −1)</w:t>
+            </w:r>
+          </w:p>
+        </w:tc>
+      </w:tr>
+      <w:tr>
+        <w:tc>
+          <w:tcPr>
+            <w:tcW w:type="dxa" w:w="1100"/>
+            <w:tcBorders>
+              <w:top w:val="single" w:color="555555" w:sz="6"/>
+              <w:left w:val="single" w:color="555555" w:sz="6"/>
+              <w:bottom w:val="single" w:color="555555" w:sz="6"/>
+              <w:right w:val="single" w:color="555555" w:sz="6"/>
+            </w:tcBorders>
+            <w:shd w:fill="E6F4F4" w:val="clear"/>
+            <w:tcMar>
+              <w:top w:type="dxa" w:w="80"/>
+              <w:left w:type="dxa" w:w="120"/>
+              <w:bottom w:type="dxa" w:w="80"/>
+              <w:right w:type="dxa" w:w="120"/>
+            </w:tcMar>
+          </w:tcPr>
+          <w:p>
+            <w:pPr>
+              <w:jc w:val="center"/>
+            </w:pPr>
+            <w:r>
+              <w:rPr>
+                <w:b/>
+                <w:bCs/>
+                <w:sz w:val="28"/>
+                <w:szCs w:val="28"/>
+              </w:rPr>
+              <w:t xml:space="preserve">Local minimum</w:t>
+            </w:r>
+          </w:p>
+        </w:tc>
+        <w:tc>
+          <w:tcPr>
+            <w:tcW w:type="dxa" w:w="7900"/>
+            <w:tcBorders>
+              <w:top w:val="single" w:color="555555" w:sz="6"/>
+              <w:left w:val="single" w:color="555555" w:sz="6"/>
+              <w:bottom w:val="single" w:color="555555" w:sz="6"/>
+              <w:right w:val="single" w:color="555555" w:sz="6"/>
+            </w:tcBorders>
+            <w:tcMar>
+              <w:top w:type="dxa" w:w="80"/>
+              <w:left w:type="dxa" w:w="120"/>
+              <w:bottom w:type="dxa" w:w="80"/>
+              <w:right w:type="dxa" w:w="120"/>
+            </w:tcMar>
+          </w:tcPr>
+          <w:p>
+            <w:pPr>
+              <w:jc w:val="center"/>
+            </w:pPr>
+            <w:r>
+              <w:rPr>
+                <w:b w:val="false"/>
+                <w:bCs w:val="false"/>
+                <w:sz w:val="28"/>
+                <w:szCs w:val="28"/>
+              </w:rPr>
+              <w:t xml:space="preserve">(−2, −6)</w:t>
+            </w:r>
+          </w:p>
+        </w:tc>
+      </w:tr>
+      <w:tr>
+        <w:tc>
+          <w:tcPr>
+            <w:tcW w:type="dxa" w:w="1100"/>
+            <w:tcBorders>
+              <w:top w:val="single" w:color="555555" w:sz="6"/>
+              <w:left w:val="single" w:color="555555" w:sz="6"/>
+              <w:bottom w:val="single" w:color="555555" w:sz="6"/>
+              <w:right w:val="single" w:color="555555" w:sz="6"/>
+            </w:tcBorders>
+            <w:shd w:fill="E6F4F4" w:val="clear"/>
+            <w:tcMar>
+              <w:top w:type="dxa" w:w="80"/>
+              <w:left w:type="dxa" w:w="120"/>
+              <w:bottom w:type="dxa" w:w="80"/>
+              <w:right w:type="dxa" w:w="120"/>
+            </w:tcMar>
+          </w:tcPr>
+          <w:p>
+            <w:pPr>
+              <w:jc w:val="center"/>
+            </w:pPr>
+            <w:r>
+              <w:rPr>
+                <w:b/>
+                <w:bCs/>
+                <w:sz w:val="28"/>
+                <w:szCs w:val="28"/>
+              </w:rPr>
+              <w:t xml:space="preserve">Decreasing on</w:t>
+            </w:r>
+          </w:p>
+        </w:tc>
+        <w:tc>
+          <w:tcPr>
+            <w:tcW w:type="dxa" w:w="7900"/>
+            <w:tcBorders>
+              <w:top w:val="single" w:color="555555" w:sz="6"/>
+              <w:left w:val="single" w:color="555555" w:sz="6"/>
+              <w:bottom w:val="single" w:color="555555" w:sz="6"/>
+              <w:right w:val="single" w:color="555555" w:sz="6"/>
+            </w:tcBorders>
+            <w:tcMar>
+              <w:top w:type="dxa" w:w="80"/>
+              <w:left w:type="dxa" w:w="120"/>
+              <w:bottom w:type="dxa" w:w="80"/>
+              <w:right w:type="dxa" w:w="120"/>
+            </w:tcMar>
+          </w:tcPr>
+          <w:p>
+            <w:pPr>
+              <w:jc w:val="center"/>
+            </w:pPr>
+            <w:r>
+              <w:rPr>
+                <w:b w:val="false"/>
+                <w:bCs w:val="false"/>
+                <w:sz w:val="28"/>
+                <w:szCs w:val="28"/>
+              </w:rPr>
+              <w:t xml:space="preserve">(−8, −2) ∪ (3, 9)</w:t>
+            </w:r>
+          </w:p>
+        </w:tc>
+      </w:tr>
+    </w:tbl>
+    <w:p>
+      <w:pPr>
+        <w:pStyle w:val="Heading3"/>
+        <w:keepNext/>
+      </w:pPr>
+      <w:r>
+        <w:t xml:space="preserve">Question</w:t>
+      </w:r>
+    </w:p>
+    <w:p>
+      <w:pPr>
+        <w:spacing w:after="120" w:before="80" w:line="300"/>
+      </w:pPr>
+      <w:r>
+        <w:t xml:space="preserve">Like a CheckIt list, this one does not say where the graph increases. Where must it increase?</w:t>
+      </w:r>
+    </w:p>
+    <w:p>
+      <w:pPr>
+        <w:spacing w:after="40" w:before="20"/>
+        <w:ind w:left="360"/>
+      </w:pPr>
+      <w:r>
+        <w:rPr>
+          <w:b/>
+          <w:bCs/>
+        </w:rPr>
+        <w:t xml:space="preserve">A.  </w:t>
+      </w:r>
+      <w:r>
+        <w:t xml:space="preserve">(−2, 3) only, between the turns</w:t>
+      </w:r>
+    </w:p>
+    <w:p>
+      <w:pPr>
+        <w:spacing w:after="40" w:before="20"/>
+        <w:ind w:left="360"/>
+      </w:pPr>
+      <w:r>
+        <w:rPr>
+          <w:b/>
+          <w:bCs/>
+        </w:rPr>
+        <w:t xml:space="preserve">B.  </w:t>
+      </w:r>
+      <w:r>
+        <w:t xml:space="preserve">(−10, −8) ∪ (−2, 3)</w:t>
+      </w:r>
+    </w:p>
+    <w:p>
+      <w:pPr>
+        <w:spacing w:after="40" w:before="20"/>
+        <w:ind w:left="360"/>
+      </w:pPr>
+      <w:r>
+        <w:rPr>
+          <w:b/>
+          <w:bCs/>
+        </w:rPr>
+        <w:t xml:space="preserve">C.  </w:t>
+      </w:r>
+      <w:r>
+        <w:t xml:space="preserve">(−8, −2) ∪ (3, 9)</w:t>
+      </w:r>
+    </w:p>
+    <w:p>
+      <w:pPr>
+        <w:spacing w:after="40" w:before="20"/>
+        <w:ind w:left="360"/>
+      </w:pPr>
+      <w:r>
+        <w:rPr>
+          <w:b/>
+          <w:bCs/>
+        </w:rPr>
+        <w:t xml:space="preserve">D.  </w:t>
+      </w:r>
+      <w:r>
+        <w:t xml:space="preserve">(−6, 4)</w:t>
+      </w:r>
+    </w:p>
+    <w:p>
+      <w:pPr>
+        <w:pStyle w:val="Heading3"/>
+        <w:keepNext/>
+      </w:pPr>
+      <w:r>
+        <w:t xml:space="preserve">Answer and reasoning</w:t>
+      </w:r>
+    </w:p>
+    <w:p>
+      <w:pPr>
+        <w:spacing w:after="120" w:before="80" w:line="300"/>
+      </w:pPr>
+      <w:r>
+        <w:t xml:space="preserve">Everywhere in the domain that the graph is not decreasing, it is increasing, apart from the turning points themselves. The domain starts at −10 and the graph is decreasing from −8, so it rises from the left end up to the local maximum at </w:t>
+      </w:r>
+      <w:r>
+        <w:rPr>
+          <w:i/>
+          <w:iCs/>
+        </w:rPr>
+        <w:t xml:space="preserve">x=−8</w:t>
+      </w:r>
+      <w:r>
+        <w:t xml:space="preserve">. It also rises from the local minimum at </w:t>
+      </w:r>
+      <w:r>
+        <w:rPr>
+          <w:i/>
+          <w:iCs/>
+        </w:rPr>
+        <w:t xml:space="preserve">x=−2</w:t>
+      </w:r>
+      <w:r>
+        <w:t xml:space="preserve"> to the local maximum at </w:t>
+      </w:r>
+      <w:r>
+        <w:rPr>
+          <w:i/>
+          <w:iCs/>
+        </w:rPr>
+        <w:t xml:space="preserve">x=3</w:t>
+      </w:r>
+      <w:r>
+        <w:t xml:space="preserve">. </w:t>
+      </w:r>
+      <w:r>
+        <w:rPr>
+          <w:i/>
+          <w:iCs/>
+        </w:rPr>
+        <w:t xml:space="preserve">(−2,3)</w:t>
+      </w:r>
+      <w:r>
+        <w:t xml:space="preserve"> alone forgets the stretch from the left end; </w:t>
+      </w:r>
+      <w:r>
+        <w:rPr>
+          <w:i/>
+          <w:iCs/>
+        </w:rPr>
+        <w:t xml:space="preserve">(−8,−2)∪(3,9)</w:t>
+      </w:r>
+      <w:r>
+        <w:t xml:space="preserve"> repeats the decreasing intervals; and </w:t>
+      </w:r>
+      <w:r>
+        <w:rPr>
+          <w:i/>
+          <w:iCs/>
+        </w:rPr>
+        <w:t xml:space="preserve">(−6,4)</w:t>
+      </w:r>
+      <w:r>
+        <w:t xml:space="preserve"> uses heights. </w:t>
+      </w:r>
+      <w:r>
+        <w:rPr>
+          <w:b/>
+          <w:bCs/>
+          <w:i/>
+          <w:iCs/>
+        </w:rPr>
+        <w:t xml:space="preserve">(−10,−8)∪(−2,3)</w:t>
+      </w:r>
+      <w:r>
+        <w:rPr>
+          <w:b/>
+          <w:bCs/>
+        </w:rPr>
+        <w:t xml:space="preserve">.</w:t>
+      </w:r>
+    </w:p>
+    <w:p>
+      <w:pPr>
+        <w:pStyle w:val="Heading2"/>
+        <w:pageBreakBefore/>
+      </w:pPr>
+      <w:r>
+        <w:t xml:space="preserve">Example 12: Impossible?</w:t>
+      </w:r>
+    </w:p>
+    <w:p>
+      <w:pPr>
+        <w:keepNext/>
+        <w:spacing w:after="120" w:before="80" w:line="300"/>
+      </w:pPr>
+      <w:r>
+        <w:rPr>
+          <w:b/>
+          <w:bCs/>
+        </w:rPr>
+        <w:t xml:space="preserve">Table 2. </w:t>
+      </w:r>
+      <w:r>
+        <w:t xml:space="preserve">Four lists of features for a sketch</w:t>
+      </w:r>
+    </w:p>
+    <w:tbl>
+      <w:tblPr>
+        <w:tblW w:type="dxa" w:w="9000"/>
+        <w:tblBorders>
+          <w:top w:val="single" w:color="auto" w:sz="4"/>
+          <w:left w:val="single" w:color="auto" w:sz="4"/>
+          <w:bottom w:val="single" w:color="auto" w:sz="4"/>
+          <w:right w:val="single" w:color="auto" w:sz="4"/>
+          <w:insideH w:val="single" w:color="auto" w:sz="4"/>
+          <w:insideV w:val="single" w:color="auto" w:sz="4"/>
+        </w:tblBorders>
+      </w:tblPr>
+      <w:tblGrid>
+        <w:gridCol w:w="1100"/>
+        <w:gridCol w:w="7900"/>
+      </w:tblGrid>
+      <w:tr>
+        <w:tc>
+          <w:tcPr>
+            <w:tcW w:type="dxa" w:w="1100"/>
+            <w:tcBorders>
+              <w:top w:val="single" w:color="555555" w:sz="6"/>
+              <w:left w:val="single" w:color="555555" w:sz="6"/>
+              <w:bottom w:val="single" w:color="555555" w:sz="6"/>
+              <w:right w:val="single" w:color="555555" w:sz="6"/>
+            </w:tcBorders>
+            <w:shd w:fill="E6F4F4" w:val="clear"/>
+            <w:tcMar>
+              <w:top w:type="dxa" w:w="80"/>
+              <w:left w:type="dxa" w:w="120"/>
+              <w:bottom w:type="dxa" w:w="80"/>
+              <w:right w:type="dxa" w:w="120"/>
+            </w:tcMar>
+          </w:tcPr>
+          <w:p>
+            <w:pPr>
+              <w:jc w:val="center"/>
+            </w:pPr>
+            <w:r>
+              <w:rPr>
+                <w:b/>
+                <w:bCs/>
+                <w:sz w:val="28"/>
+                <w:szCs w:val="28"/>
+              </w:rPr>
+              <w:t xml:space="preserve">List A</w:t>
             </w:r>
           </w:p>
         </w:tc>
@@ -2763,7 +3055,7 @@
                 <w:sz w:val="28"/>
                 <w:szCs w:val="28"/>
               </w:rPr>
-              <w:t xml:space="preserve">B</w:t>
+              <w:t xml:space="preserve">List B</w:t>
             </w:r>
           </w:p>
         </w:tc>
@@ -2828,7 +3120,7 @@
                 <w:sz w:val="28"/>
                 <w:szCs w:val="28"/>
               </w:rPr>
-              <w:t xml:space="preserve">C</w:t>
+              <w:t xml:space="preserve">List C</w:t>
             </w:r>
           </w:p>
         </w:tc>
@@ -2893,7 +3185,7 @@
                 <w:sz w:val="28"/>
                 <w:szCs w:val="28"/>
               </w:rPr>
-              <w:t xml:space="preserve">D</w:t>
+              <w:t xml:space="preserve">List D</w:t>
             </w:r>
           </w:p>
         </w:tc>
@@ -3121,9 +3413,9 @@
       <w:r>
         <w:drawing>
           <wp:inline distT="0" distB="0" distL="0" distR="0">
-            <wp:extent cx="2924175" cy="2476500"/>
+            <wp:extent cx="3267075" cy="2476500"/>
             <wp:effectExtent t="0" r="0" b="0" l="0"/>
-            <wp:docPr id="1" name="sl1" descr="The graph of a function g with a dot at each end. Plotted data: A graph of g on a grid with lines every 1 unit, with x from −17 to 10 and y from −16 to 7. It starts at an open dot at (−16, −15) and rises steeply, crossing the x-axis at (−13, 0), to a high point at (−10, 5). It falls, crossing the x-axis at (−7, 0), to a low point at (−2, −8), then rises through (0, −4) to a high point at (3, −2). Then it falls to a filled dot at (9, −7)." title="The graph of a function g with a dot at each end"/>
+            <wp:docPr id="1" name="sl1" descr="The graph of a function g with a dot at each end. Plotted data: A graph of g on a grid with lines every 1 unit, with x from −12 to 12 and y from −5 to 13. From a filled dot at (−11, 12), it goes down steeply through (−9, 0) to (−7, −4), where it turns. It goes up through (−5, 0) to (−1, 9), where it turns, then down through (0, 5) to (4, 2), where it turns again. Then it goes up to an open dot at (11, 8). There are small corners where its pieces join, at x = −5, −2, 0 and 8." title="The graph of a function g with a dot at each end"/>
             <wp:cNvGraphicFramePr>
               <a:graphicFrameLocks xmlns:a="http://schemas.openxmlformats.org/drawingml/2006/main" noChangeAspect="1"/>
             </wp:cNvGraphicFramePr>
@@ -3146,7 +3438,7 @@
                   <pic:spPr bwMode="auto">
                     <a:xfrm>
                       <a:off x="0" y="0"/>
-                      <a:ext cx="2924175" cy="2476500"/>
+                      <a:ext cx="3267075" cy="2476500"/>
                     </a:xfrm>
                     <a:prstGeom prst="rect">
                       <a:avLst/>
@@ -3177,7 +3469,7 @@
           <w:sz w:val="22"/>
           <w:szCs w:val="22"/>
         </w:rPr>
-        <w:t xml:space="preserve">A graph of g on a grid with lines every 1 unit, with x from −17 to 10 and y from −16 to 7. It starts at an open dot at (−16, −15) and rises steeply, crossing the x-axis at (−13, 0), to a high point at (−10, 5). It falls, crossing the x-axis at (−7, 0), to a low point at (−2, −8), then rises through (0, −4) to a high point at (3, −2). Then it falls to a filled dot at (9, −7).</w:t>
+        <w:t xml:space="preserve">A graph of g on a grid with lines every 1 unit, with x from −12 to 12 and y from −5 to 13. From a filled dot at (−11, 12), it goes down steeply through (−9, 0) to (−7, −4), where it turns. It goes up through (−5, 0) to (−1, 9), where it turns, then down through (0, 5) to (4, 2), where it turns again. Then it goes up to an open dot at (11, 8). There are small corners where its pieces join, at x = −5, −2, 0 and 8.</w:t>
       </w:r>
     </w:p>
     <w:p>
@@ -3194,7 +3486,7 @@
         <w:spacing w:after="120" w:before="80" w:line="300"/>
       </w:pPr>
       <w:r>
-        <w:t xml:space="preserve">A student says g is increasing on (−15, 5) ∪ (−8, −2). What is the mistake, if any?</w:t>
+        <w:t xml:space="preserve">A student says g is increasing on (−4, 9) ∪ (2, 8). What is the mistake, if any?</w:t>
       </w:r>
     </w:p>
     <w:p>
@@ -3242,7 +3534,7 @@
         <w:t xml:space="preserve">C.  </w:t>
       </w:r>
       <w:r>
-        <w:t xml:space="preserve">Those are y-values; use x-values: (−16, −10) ∪ (−2, 3).</w:t>
+        <w:t xml:space="preserve">Those are y-values; use x-values: (−7, −1) ∪ (4, 11).</w:t>
       </w:r>
     </w:p>
     <w:p>
@@ -3275,7 +3567,7 @@
         <w:spacing w:after="120" w:before="80" w:line="300"/>
       </w:pPr>
       <w:r>
-        <w:t xml:space="preserve">The student read heights: −15 up to 5, and −8 up to −2. Intervals of increase are written with </w:t>
+        <w:t xml:space="preserve">The student read heights: −4 up to 9, and 2 up to 8. Intervals of increase are written with </w:t>
       </w:r>
       <w:r>
         <w:rPr>
@@ -3285,44 +3577,44 @@
         <w:t xml:space="preserve">x</w:t>
       </w:r>
       <w:r>
-        <w:t xml:space="preserve">-values: the graph rises from the left end at </w:t>
-      </w:r>
-      <w:r>
-        <w:rPr>
-          <w:i/>
-          <w:iCs/>
-        </w:rPr>
-        <w:t xml:space="preserve">x=−16</w:t>
-      </w:r>
-      <w:r>
-        <w:t xml:space="preserve"> to the peak at </w:t>
-      </w:r>
-      <w:r>
-        <w:rPr>
-          <w:i/>
-          <w:iCs/>
-        </w:rPr>
-        <w:t xml:space="preserve">x=−10</w:t>
-      </w:r>
-      <w:r>
-        <w:t xml:space="preserve">, and from the low point at </w:t>
-      </w:r>
-      <w:r>
-        <w:rPr>
-          <w:i/>
-          <w:iCs/>
-        </w:rPr>
-        <w:t xml:space="preserve">x=−2</w:t>
-      </w:r>
-      <w:r>
-        <w:t xml:space="preserve"> to the high point at </w:t>
-      </w:r>
-      <w:r>
-        <w:rPr>
-          <w:i/>
-          <w:iCs/>
-        </w:rPr>
-        <w:t xml:space="preserve">x=3</w:t>
+        <w:t xml:space="preserve">-values: the graph rises from the turn at </w:t>
+      </w:r>
+      <w:r>
+        <w:rPr>
+          <w:i/>
+          <w:iCs/>
+        </w:rPr>
+        <w:t xml:space="preserve">x=−7</w:t>
+      </w:r>
+      <w:r>
+        <w:t xml:space="preserve"> to the turn at </w:t>
+      </w:r>
+      <w:r>
+        <w:rPr>
+          <w:i/>
+          <w:iCs/>
+        </w:rPr>
+        <w:t xml:space="preserve">x=−1</w:t>
+      </w:r>
+      <w:r>
+        <w:t xml:space="preserve">, and from the turn at </w:t>
+      </w:r>
+      <w:r>
+        <w:rPr>
+          <w:i/>
+          <w:iCs/>
+        </w:rPr>
+        <w:t xml:space="preserve">x=4</w:t>
+      </w:r>
+      <w:r>
+        <w:t xml:space="preserve"> to the right end at </w:t>
+      </w:r>
+      <w:r>
+        <w:rPr>
+          <w:i/>
+          <w:iCs/>
+        </w:rPr>
+        <w:t xml:space="preserve">x=11</w:t>
       </w:r>
       <w:r>
         <w:t xml:space="preserve">. These are the rising stretches, not the falling ones, and CheckIt writes them with parentheses. </w:t>
@@ -3341,7 +3633,7 @@
           <w:i/>
           <w:iCs/>
         </w:rPr>
-        <w:t xml:space="preserve">(−16,−10)∪(−2,3)</w:t>
+        <w:t xml:space="preserve">(−7,−1)∪(4,11)</w:t>
       </w:r>
       <w:r>
         <w:rPr>
@@ -3369,7 +3661,7 @@
           <wp:inline distT="0" distB="0" distL="0" distR="0">
             <wp:extent cx="3267075" cy="2476500"/>
             <wp:effectExtent t="0" r="0" b="0" l="0"/>
-            <wp:docPr id="1" name="sl2" descr="The graph of a function g with a dot at each end. Plotted data: A graph of g on a grid with lines every 1 unit, with x from −12 to 12 and y from −5 to 13. It starts at a filled dot at (−11, 12) and falls steeply, crossing the x-axis at (−9, 0), to a low point at (−7, −4). It rises, crossing the x-axis at (−5, 0), to a high point at (−1, 9), then falls through (0, 5) to a low point at (4, 2). Then it rises to an open dot at (11, 8)." title="The graph of a function g with a dot at each end"/>
+            <wp:docPr id="1" name="sl2" descr="The graph of a function g with a dot at each end. Plotted data: A graph of g on a grid with lines every 1 unit, with x from −12 to 12 and y from −5 to 13. From a filled dot at (−11, 12), it goes down steeply through (−9, 0) to (−7, −4), where it turns. It goes up through (−5, 0) to (−1, 9), where it turns, then down through (0, 5) to (4, 2), where it turns again. Then it goes up to an open dot at (11, 8). There are small corners where its pieces join, at x = −5, −2, 0 and 8." title="The graph of a function g with a dot at each end"/>
             <wp:cNvGraphicFramePr>
               <a:graphicFrameLocks xmlns:a="http://schemas.openxmlformats.org/drawingml/2006/main" noChangeAspect="1"/>
             </wp:cNvGraphicFramePr>
@@ -3423,7 +3715,7 @@
           <w:sz w:val="22"/>
           <w:szCs w:val="22"/>
         </w:rPr>
-        <w:t xml:space="preserve">A graph of g on a grid with lines every 1 unit, with x from −12 to 12 and y from −5 to 13. It starts at a filled dot at (−11, 12) and falls steeply, crossing the x-axis at (−9, 0), to a low point at (−7, −4). It rises, crossing the x-axis at (−5, 0), to a high point at (−1, 9), then falls through (0, 5) to a low point at (4, 2). Then it rises to an open dot at (11, 8).</w:t>
+        <w:t xml:space="preserve">A graph of g on a grid with lines every 1 unit, with x from −12 to 12 and y from −5 to 13. From a filled dot at (−11, 12), it goes down steeply through (−9, 0) to (−7, −4), where it turns. It goes up through (−5, 0) to (−1, 9), where it turns, then down through (0, 5) to (4, 2), where it turns again. Then it goes up to an open dot at (11, 8). There are small corners where its pieces join, at x = −5, −2, 0 and 8.</w:t>
       </w:r>
     </w:p>
     <w:p>
@@ -3575,7 +3867,7 @@
           <wp:inline distT="0" distB="0" distL="0" distR="0">
             <wp:extent cx="2924175" cy="2476500"/>
             <wp:effectExtent t="0" r="0" b="0" l="0"/>
-            <wp:docPr id="1" name="sl3" descr="The graph of a function g with a dot at each end. Plotted data: A graph of g on a grid with lines every 1 unit, with x from −17 to 10 and y from −16 to 7. It starts at an open dot at (−16, −15) and rises steeply, crossing the x-axis at (−13, 0), to a high point at (−10, 5). It falls, crossing the x-axis at (−7, 0), to a low point at (−2, −8), then rises through (0, −4) to a high point at (3, −2). Then it falls to a filled dot at (9, −7)." title="The graph of a function g with a dot at each end"/>
+            <wp:docPr id="1" name="sl3" descr="The graph of a function g with a dot at each end. Plotted data: A graph of g on a grid with lines every 1 unit, with x from −17 to 10 and y from −16 to 7. From an open dot at (−16, −15), it goes up steeply through (−13, 0) to (−10, 5), where it turns. It goes down through (−7, 0) to (−2, −8), where it turns, then up through (0, −4) to (3, −2), where it turns again. Then it goes down to a filled dot at (9, −7). There are small corners where its pieces join, at x = −7, −4, 0 and 6." title="The graph of a function g with a dot at each end"/>
             <wp:cNvGraphicFramePr>
               <a:graphicFrameLocks xmlns:a="http://schemas.openxmlformats.org/drawingml/2006/main" noChangeAspect="1"/>
             </wp:cNvGraphicFramePr>
@@ -3629,7 +3921,7 @@
           <w:sz w:val="22"/>
           <w:szCs w:val="22"/>
         </w:rPr>
-        <w:t xml:space="preserve">A graph of g on a grid with lines every 1 unit, with x from −17 to 10 and y from −16 to 7. It starts at an open dot at (−16, −15) and rises steeply, crossing the x-axis at (−13, 0), to a high point at (−10, 5). It falls, crossing the x-axis at (−7, 0), to a low point at (−2, −8), then rises through (0, −4) to a high point at (3, −2). Then it falls to a filled dot at (9, −7).</w:t>
+        <w:t xml:space="preserve">A graph of g on a grid with lines every 1 unit, with x from −17 to 10 and y from −16 to 7. From an open dot at (−16, −15), it goes up steeply through (−13, 0) to (−10, 5), where it turns. It goes down through (−7, 0) to (−2, −8), where it turns, then up through (0, −4) to (3, −2), where it turns again. Then it goes down to a filled dot at (9, −7). There are small corners where its pieces join, at x = −7, −4, 0 and 6.</w:t>
       </w:r>
     </w:p>
     <w:p>
@@ -3694,7 +3986,7 @@
         <w:t xml:space="preserve">C.  </w:t>
       </w:r>
       <w:r>
-        <w:t xml:space="preserve">It should be (−15, 5], the lowest and highest values.</w:t>
+        <w:t xml:space="preserve">It should be (−17, 10), the edges of the grid shown.</w:t>
       </w:r>
     </w:p>
     <w:p>
@@ -3764,10 +4056,10 @@
           <w:i/>
           <w:iCs/>
         </w:rPr>
-        <w:t xml:space="preserve">(−15,5]</w:t>
-      </w:r>
-      <w:r>
-        <w:t xml:space="preserve"> is the range; and the domain covers the whole graph, not just the stretch between the </w:t>
+        <w:t xml:space="preserve">(−17,10)</w:t>
+      </w:r>
+      <w:r>
+        <w:t xml:space="preserve"> reads the edges of the grid instead of the graph; and the domain covers the whole graph, not just the stretch between the </w:t>
       </w:r>
       <w:r>
         <w:rPr>
@@ -3805,7 +4097,7 @@
           <wp:inline distT="0" distB="0" distL="0" distR="0">
             <wp:extent cx="2914650" cy="2476500"/>
             <wp:effectExtent t="0" r="0" b="0" l="0"/>
-            <wp:docPr id="1" name="sl4" descr="The graph of a function g with a dot at each end. Plotted data: A graph of g on a grid with lines every 1 unit, with x from −17 to 10 and y from −16 to 7. It starts at an open dot at (−16, −15) and rises steeply, crossing the x-axis at (−13, 0), to a high point at (−10, 5). It falls, crossing the x-axis at (−7, 0), to a low point at (−2, −8), then rises through (0, −4) to a high point at (3, −2). Then it falls to a filled dot at (9, −7)." title="The graph of a function g with a dot at each end"/>
+            <wp:docPr id="1" name="sl4" descr="The graph of a function g with a dot at each end. Plotted data: A graph of g on a grid with lines every 1 unit, with x from −17 to 10 and y from −16 to 7. From an open dot at (−16, −15), it goes up steeply through (−13, 0) to (−10, 5), where it turns. It goes down through (−7, 0) to (−2, −8), where it turns, then up through (0, −4) to (3, −2), where it turns again. Then it goes down to a filled dot at (9, −7). There are small corners where its pieces join, at x = −7, −4, 0 and 6." title="The graph of a function g with a dot at each end"/>
             <wp:cNvGraphicFramePr>
               <a:graphicFrameLocks xmlns:a="http://schemas.openxmlformats.org/drawingml/2006/main" noChangeAspect="1"/>
             </wp:cNvGraphicFramePr>
@@ -3859,7 +4151,7 @@
           <w:sz w:val="22"/>
           <w:szCs w:val="22"/>
         </w:rPr>
-        <w:t xml:space="preserve">A graph of g on a grid with lines every 1 unit, with x from −17 to 10 and y from −16 to 7. It starts at an open dot at (−16, −15) and rises steeply, crossing the x-axis at (−13, 0), to a high point at (−10, 5). It falls, crossing the x-axis at (−7, 0), to a low point at (−2, −8), then rises through (0, −4) to a high point at (3, −2). Then it falls to a filled dot at (9, −7).</w:t>
+        <w:t xml:space="preserve">A graph of g on a grid with lines every 1 unit, with x from −17 to 10 and y from −16 to 7. From an open dot at (−16, −15), it goes up steeply through (−13, 0) to (−10, 5), where it turns. It goes down through (−7, 0) to (−2, −8), where it turns, then up through (0, −4) to (3, −2), where it turns again. Then it goes down to a filled dot at (9, −7). There are small corners where its pieces join, at x = −7, −4, 0 and 6.</w:t>
       </w:r>
     </w:p>
     <w:p>
@@ -3967,27 +4259,7 @@
         <w:t xml:space="preserve">(−16,−15)</w:t>
       </w:r>
       <w:r>
-        <w:t xml:space="preserve">, so it takes every height above −15 without reaching −15. The top is 5, at the peak </w:t>
-      </w:r>
-      <w:r>
-        <w:rPr>
-          <w:i/>
-          <w:iCs/>
-        </w:rPr>
-        <w:t xml:space="preserve">(−10,5)</w:t>
-      </w:r>
-      <w:r>
-        <w:t xml:space="preserve">, which is reached. So </w:t>
-      </w:r>
-      <w:r>
-        <w:rPr>
-          <w:i/>
-          <w:iCs/>
-        </w:rPr>
-        <w:t xml:space="preserve">(−15,5]</w:t>
-      </w:r>
-      <w:r>
-        <w:t xml:space="preserve">. </w:t>
+        <w:t xml:space="preserve">, so it takes every height above −15 without reaching −15. At the top, the highest turning point is reached, so that end gets a bracket. </w:t>
       </w:r>
       <w:r>
         <w:rPr>
@@ -3997,7 +4269,17 @@
         <w:t xml:space="preserve">[−16,9]</w:t>
       </w:r>
       <w:r>
-        <w:t xml:space="preserve"> is the domain, and a bracket at −15 ignores the open dot. </w:t>
+        <w:t xml:space="preserve"> uses the </w:t>
+      </w:r>
+      <w:r>
+        <w:rPr>
+          <w:i/>
+          <w:iCs/>
+        </w:rPr>
+        <w:t xml:space="preserve">x</w:t>
+      </w:r>
+      <w:r>
+        <w:t xml:space="preserve">-values of the ends, not heights, and a bracket at −15 ignores the open dot. </w:t>
       </w:r>
       <w:r>
         <w:rPr>
@@ -4032,9 +4314,9 @@
       <w:r>
         <w:drawing>
           <wp:inline distT="0" distB="0" distL="0" distR="0">
-            <wp:extent cx="2924175" cy="2476500"/>
+            <wp:extent cx="3267075" cy="2476500"/>
             <wp:effectExtent t="0" r="0" b="0" l="0"/>
-            <wp:docPr id="1" name="sl5" descr="The graph of a function g with a dot at each end. Plotted data: A graph of g on a grid with lines every 1 unit, with x from −17 to 10 and y from −16 to 7. It starts at an open dot at (−16, −15) and rises steeply, crossing the x-axis at (−13, 0), to a high point at (−10, 5). It falls, crossing the x-axis at (−7, 0), to a low point at (−2, −8), then rises through (0, −4) to a high point at (3, −2). Then it falls to a filled dot at (9, −7)." title="The graph of a function g with a dot at each end"/>
+            <wp:docPr id="1" name="sl5" descr="The graph of a function g with a dot at each end. Plotted data: A graph of g on a grid with lines every 1 unit, with x from −12 to 12 and y from −5 to 13. From a filled dot at (−11, 12), it goes down steeply through (−9, 0) to (−7, −4), where it turns. It goes up through (−5, 0) to (−1, 9), where it turns, then down through (0, 5) to (4, 2), where it turns again. Then it goes up to an open dot at (11, 8). There are small corners where its pieces join, at x = −5, −2, 0 and 8." title="The graph of a function g with a dot at each end"/>
             <wp:cNvGraphicFramePr>
               <a:graphicFrameLocks xmlns:a="http://schemas.openxmlformats.org/drawingml/2006/main" noChangeAspect="1"/>
             </wp:cNvGraphicFramePr>
@@ -4057,7 +4339,7 @@
                   <pic:spPr bwMode="auto">
                     <a:xfrm>
                       <a:off x="0" y="0"/>
-                      <a:ext cx="2924175" cy="2476500"/>
+                      <a:ext cx="3267075" cy="2476500"/>
                     </a:xfrm>
                     <a:prstGeom prst="rect">
                       <a:avLst/>
@@ -4088,7 +4370,7 @@
           <w:sz w:val="22"/>
           <w:szCs w:val="22"/>
         </w:rPr>
-        <w:t xml:space="preserve">A graph of g on a grid with lines every 1 unit, with x from −17 to 10 and y from −16 to 7. It starts at an open dot at (−16, −15) and rises steeply, crossing the x-axis at (−13, 0), to a high point at (−10, 5). It falls, crossing the x-axis at (−7, 0), to a low point at (−2, −8), then rises through (0, −4) to a high point at (3, −2). Then it falls to a filled dot at (9, −7).</w:t>
+        <w:t xml:space="preserve">A graph of g on a grid with lines every 1 unit, with x from −12 to 12 and y from −5 to 13. From a filled dot at (−11, 12), it goes down steeply through (−9, 0) to (−7, −4), where it turns. It goes up through (−5, 0) to (−1, 9), where it turns, then down through (0, 5) to (4, 2), where it turns again. Then it goes up to an open dot at (11, 8). There are small corners where its pieces join, at x = −5, −2, 0 and 8.</w:t>
       </w:r>
     </w:p>
     <w:p>
@@ -4105,7 +4387,7 @@
         <w:spacing w:after="120" w:before="80" w:line="300"/>
       </w:pPr>
       <w:r>
-        <w:t xml:space="preserve">A student says g has no global maximum, because the graph keeps falling toward the open dot on the left. What is the mistake, if any?</w:t>
+        <w:t xml:space="preserve">A student says g has no global minimum, because the graph ends at an open dot. What is the mistake, if any?</w:t>
       </w:r>
     </w:p>
     <w:p>
@@ -4137,7 +4419,7 @@
         <w:t xml:space="preserve">B.  </w:t>
       </w:r>
       <w:r>
-        <w:t xml:space="preserve">The open dot is at the bottom; the global max is 5.</w:t>
+        <w:t xml:space="preserve">The open dot is not the lowest place; the global min is −4.</w:t>
       </w:r>
     </w:p>
     <w:p>
@@ -4153,7 +4435,7 @@
         <w:t xml:space="preserve">C.  </w:t>
       </w:r>
       <w:r>
-        <w:t xml:space="preserve">The global maximum is −7, at the filled dot on the right end.</w:t>
+        <w:t xml:space="preserve">The global minimum is 8, at the open dot on the right end.</w:t>
       </w:r>
     </w:p>
     <w:p>
@@ -4169,7 +4451,7 @@
         <w:t xml:space="preserve">D.  </w:t>
       </w:r>
       <w:r>
-        <w:t xml:space="preserve">The global maximum is −15, at the open dot on the left end.</w:t>
+        <w:t xml:space="preserve">The global minimum is 2, at the last turning point, (4, 2).</w:t>
       </w:r>
     </w:p>
     <w:p>
@@ -4186,34 +4468,44 @@
         <w:spacing w:after="120" w:before="80" w:line="300"/>
       </w:pPr>
       <w:r>
-        <w:t xml:space="preserve">The open dot at </w:t>
-      </w:r>
-      <w:r>
-        <w:rPr>
-          <w:i/>
-          <w:iCs/>
-        </w:rPr>
-        <w:t xml:space="preserve">(−16,−15)</w:t>
-      </w:r>
-      <w:r>
-        <w:t xml:space="preserve"> is at the bottom of the graph, so it is the global minimum that is missing. Nothing on the graph is higher than the peak at </w:t>
-      </w:r>
-      <w:r>
-        <w:rPr>
-          <w:i/>
-          <w:iCs/>
-        </w:rPr>
-        <w:t xml:space="preserve">(−10,5)</w:t>
-      </w:r>
-      <w:r>
-        <w:t xml:space="preserve">, and that point is reached, so the global maximum is 5. The right end, at −7, is not the highest point; and the open dot is the lowest place on the graph, not the highest, and it is not even reached. </w:t>
-      </w:r>
-      <w:r>
-        <w:rPr>
-          <w:b/>
-          <w:bCs/>
-        </w:rPr>
-        <w:t xml:space="preserve">The global maximum is 5.</w:t>
+        <w:t xml:space="preserve">An open dot only rules out a global maximum or minimum when it is at the very top or bottom of the graph. Here the open dot at </w:t>
+      </w:r>
+      <w:r>
+        <w:rPr>
+          <w:i/>
+          <w:iCs/>
+        </w:rPr>
+        <w:t xml:space="preserve">(11,8)</w:t>
+      </w:r>
+      <w:r>
+        <w:t xml:space="preserve"> is partway up, and the graph is lower elsewhere: its lowest point is </w:t>
+      </w:r>
+      <w:r>
+        <w:rPr>
+          <w:i/>
+          <w:iCs/>
+        </w:rPr>
+        <w:t xml:space="preserve">(−7,−4)</w:t>
+      </w:r>
+      <w:r>
+        <w:t xml:space="preserve">, which is reached. So the global minimum is −4. The open dot's height, 8, is not reached and is not the lowest; and 2 is a local minimum, but the graph goes lower at </w:t>
+      </w:r>
+      <w:r>
+        <w:rPr>
+          <w:i/>
+          <w:iCs/>
+        </w:rPr>
+        <w:t xml:space="preserve">x=−7</w:t>
+      </w:r>
+      <w:r>
+        <w:t xml:space="preserve">. </w:t>
+      </w:r>
+      <w:r>
+        <w:rPr>
+          <w:b/>
+          <w:bCs/>
+        </w:rPr>
+        <w:t xml:space="preserve">The global minimum is −4.</w:t>
       </w:r>
     </w:p>
     <w:sectPr>

</xml_diff>

<commit_message>
FN3: explanations match the new Quick Summary (intercepts meet the axis; value vs location in Local Minima and Slip 2)
Co-Authored-By: Claude Opus 5.5 <noreply@anthropic.com>
Claude-Session: https://claude.ai/code/session_013Y8PfETWcMLvmUEpCdE8Wq
</commit_message>
<xml_diff>
--- a/support-materials/FN3/FN3_worked_examples.docx
+++ b/support-materials/FN3/FN3_worked_examples.docx
@@ -778,7 +778,7 @@
         <w:t xml:space="preserve">x</w:t>
       </w:r>
       <w:r>
-        <w:t xml:space="preserve">-intercepts are where the graph crosses the </w:t>
+        <w:t xml:space="preserve">-intercepts are the points where the graph meets the </w:t>
       </w:r>
       <w:r>
         <w:rPr>
@@ -798,7 +798,7 @@
         <w:t xml:space="preserve">y=0</w:t>
       </w:r>
       <w:r>
-        <w:t xml:space="preserve">. It crosses twice, at </w:t>
+        <w:t xml:space="preserve">. This graph meets it twice, crossing it each time, at </w:t>
       </w:r>
       <w:r>
         <w:rPr>
@@ -1093,7 +1093,7 @@
         <w:t xml:space="preserve">y</w:t>
       </w:r>
       <w:r>
-        <w:t xml:space="preserve">-intercept is where the graph crosses the </w:t>
+        <w:t xml:space="preserve">-intercept is the point where the graph meets the </w:t>
       </w:r>
       <w:r>
         <w:rPr>
@@ -1113,7 +1113,7 @@
         <w:t xml:space="preserve">x=0</w:t>
       </w:r>
       <w:r>
-        <w:t xml:space="preserve">. There the graph is at height 5, so </w:t>
+        <w:t xml:space="preserve">. A function has at most one. There the graph is at height 5, so </w:t>
       </w:r>
       <w:r>
         <w:rPr>
@@ -1188,7 +1188,7 @@
       <w:r>
         <w:drawing>
           <wp:inline distT="0" distB="0" distL="0" distR="0">
-            <wp:extent cx="2914650" cy="2476500"/>
+            <wp:extent cx="2924175" cy="2476500"/>
             <wp:effectExtent t="0" r="0" b="0" l="0"/>
             <wp:docPr id="1" name="rf1" descr="The graph of a function g with a dot at each end. Plotted data: A graph of g on a grid with lines every 1 unit, with x from −17 to 10 and y from −16 to 7. From an open dot at (−16, −15), it goes up steeply through (−13, 0) to (−10, 5), where it turns. It goes down through (−7, 0) to (−2, −8), where it turns, then up through (0, −4) to (3, −2), where it turns again. Then it goes down to a filled dot at (9, −7). There are small corners where its pieces join, at x = −7, −4, 0 and 6." title="The graph of a function g with a dot at each end"/>
             <wp:cNvGraphicFramePr>
@@ -1213,7 +1213,7 @@
                   <pic:spPr bwMode="auto">
                     <a:xfrm>
                       <a:off x="0" y="0"/>
-                      <a:ext cx="2914650" cy="2476500"/>
+                      <a:ext cx="2924175" cy="2476500"/>
                     </a:xfrm>
                     <a:prstGeom prst="rect">
                       <a:avLst/>
@@ -1671,7 +1671,27 @@
         <w:t xml:space="preserve">(2,4)</w:t>
       </w:r>
       <w:r>
-        <w:t xml:space="preserve"> swap the coordinates. </w:t>
+        <w:t xml:space="preserve"> swap the coordinates. Each point gives both the minimum value and where it occurs: at </w:t>
+      </w:r>
+      <w:r>
+        <w:rPr>
+          <w:i/>
+          <w:iCs/>
+        </w:rPr>
+        <w:t xml:space="preserve">(−7,−4)</w:t>
+      </w:r>
+      <w:r>
+        <w:t xml:space="preserve">, the local minimum value is −4, occurring at </w:t>
+      </w:r>
+      <w:r>
+        <w:rPr>
+          <w:i/>
+          <w:iCs/>
+        </w:rPr>
+        <w:t xml:space="preserve">x=−7</w:t>
+      </w:r>
+      <w:r>
+        <w:t xml:space="preserve">. </w:t>
       </w:r>
       <w:r>
         <w:rPr>
@@ -3823,14 +3843,34 @@
         <w:t xml:space="preserve">(−1,9)</w:t>
       </w:r>
       <w:r>
-        <w:t xml:space="preserve"> counts even though it is not the highest point overall, and CheckIt writes extrema as points. </w:t>
-      </w:r>
-      <w:r>
-        <w:rPr>
-          <w:b/>
-          <w:bCs/>
-        </w:rPr>
-        <w:t xml:space="preserve">The only local maximum is </w:t>
+        <w:t xml:space="preserve"> counts even though it is not the highest point overall: its local maximum value is 9, occurring at </w:t>
+      </w:r>
+      <w:r>
+        <w:rPr>
+          <w:i/>
+          <w:iCs/>
+        </w:rPr>
+        <w:t xml:space="preserve">x=−1</w:t>
+      </w:r>
+      <w:r>
+        <w:t xml:space="preserve">. Answering “9 and 12” keeps the endpoint and drops where each value occurs; CheckIt names a local maximum by its point, as in “local max at </w:t>
+      </w:r>
+      <w:r>
+        <w:rPr>
+          <w:i/>
+          <w:iCs/>
+        </w:rPr>
+        <w:t xml:space="preserve">(−1,9)</w:t>
+      </w:r>
+      <w:r>
+        <w:t xml:space="preserve">.” </w:t>
+      </w:r>
+      <w:r>
+        <w:rPr>
+          <w:b/>
+          <w:bCs/>
+        </w:rPr>
+        <w:t xml:space="preserve">The only local maximum is at </w:t>
       </w:r>
       <w:r>
         <w:rPr>
@@ -4095,7 +4135,7 @@
       <w:r>
         <w:drawing>
           <wp:inline distT="0" distB="0" distL="0" distR="0">
-            <wp:extent cx="2914650" cy="2476500"/>
+            <wp:extent cx="2924175" cy="2476500"/>
             <wp:effectExtent t="0" r="0" b="0" l="0"/>
             <wp:docPr id="1" name="sl4" descr="The graph of a function g with a dot at each end. Plotted data: A graph of g on a grid with lines every 1 unit, with x from −17 to 10 and y from −16 to 7. From an open dot at (−16, −15), it goes up steeply through (−13, 0) to (−10, 5), where it turns. It goes down through (−7, 0) to (−2, −8), where it turns, then up through (0, −4) to (3, −2), where it turns again. Then it goes down to a filled dot at (9, −7). There are small corners where its pieces join, at x = −7, −4, 0 and 6." title="The graph of a function g with a dot at each end"/>
             <wp:cNvGraphicFramePr>
@@ -4120,7 +4160,7 @@
                   <pic:spPr bwMode="auto">
                     <a:xfrm>
                       <a:off x="0" y="0"/>
-                      <a:ext cx="2914650" cy="2476500"/>
+                      <a:ext cx="2924175" cy="2476500"/>
                     </a:xfrm>
                     <a:prstGeom prst="rect">
                       <a:avLst/>

</xml_diff>